<commit_message>
Updated for profiling and actuator shutdown endpoint
</commit_message>
<xml_diff>
--- a/Application Profiling.docx
+++ b/Application Profiling.docx
@@ -12,6 +12,8 @@
           <w:lang w:eastAsia="en-IN"/>
         </w:rPr>
       </w:pPr>
+      <w:bookmarkStart w:id="0" w:name="_GoBack"/>
+      <w:bookmarkEnd w:id="0"/>
       <w:r>
         <w:rPr>
           <w:rFonts w:ascii="Times New Roman" w:eastAsia="Times New Roman" w:hAnsi="Times New Roman" w:cs="Times New Roman"/>
@@ -169,8 +171,21 @@
           <w:szCs w:val="27"/>
           <w:lang w:eastAsia="en-IN"/>
         </w:rPr>
-        <w:t>Step 1: Start the Spring Boot App with JFR Enabled</w:t>
-      </w:r>
+        <w:t xml:space="preserve">Step 1: </w:t>
+      </w:r>
+      <w:bookmarkStart w:id="1" w:name="JFR"/>
+      <w:r>
+        <w:rPr>
+          <w:rFonts w:ascii="Times New Roman" w:eastAsia="Times New Roman" w:hAnsi="Times New Roman" w:cs="Times New Roman"/>
+          <w:b/>
+          <w:bCs/>
+          <w:sz w:val="27"/>
+          <w:szCs w:val="27"/>
+          <w:lang w:eastAsia="en-IN"/>
+        </w:rPr>
+        <w:t>Start the Spring Boot App with JFR Enabled</w:t>
+      </w:r>
+      <w:bookmarkEnd w:id="1"/>
     </w:p>
     <w:p>
       <w:pPr>
@@ -1281,8 +1296,6 @@
         </w:rPr>
         <w:t xml:space="preserve"> Profiler</w:t>
       </w:r>
-      <w:bookmarkStart w:id="0" w:name="_GoBack"/>
-      <w:bookmarkEnd w:id="0"/>
     </w:p>
     <w:p>
       <w:pPr>
@@ -4861,6 +4874,498 @@
     </w:p>
     <w:p/>
     <w:p/>
+    <w:p/>
+    <w:p>
+      <w:pPr>
+        <w:spacing w:after="0"/>
+        <w:rPr>
+          <w:b/>
+          <w:sz w:val="28"/>
+          <w:szCs w:val="28"/>
+        </w:rPr>
+      </w:pPr>
+      <w:r>
+        <w:rPr>
+          <w:b/>
+          <w:sz w:val="28"/>
+          <w:szCs w:val="28"/>
+        </w:rPr>
+        <w:lastRenderedPageBreak/>
+        <w:t xml:space="preserve">Either use below </w:t>
+      </w:r>
+      <w:proofErr w:type="spellStart"/>
+      <w:r>
+        <w:rPr>
+          <w:b/>
+          <w:sz w:val="28"/>
+          <w:szCs w:val="28"/>
+        </w:rPr>
+        <w:t>jvm</w:t>
+      </w:r>
+      <w:proofErr w:type="spellEnd"/>
+      <w:r>
+        <w:rPr>
+          <w:b/>
+          <w:sz w:val="28"/>
+          <w:szCs w:val="28"/>
+        </w:rPr>
+        <w:t xml:space="preserve"> arguments while running the App or can use only mentioned </w:t>
+      </w:r>
+      <w:hyperlink w:anchor="JFR" w:history="1">
+        <w:r>
+          <w:rPr>
+            <w:rStyle w:val="Hyperlink"/>
+            <w:b/>
+            <w:sz w:val="28"/>
+            <w:szCs w:val="28"/>
+          </w:rPr>
+          <w:t>he</w:t>
+        </w:r>
+        <w:r>
+          <w:rPr>
+            <w:rStyle w:val="Hyperlink"/>
+            <w:b/>
+            <w:sz w:val="28"/>
+            <w:szCs w:val="28"/>
+          </w:rPr>
+          <w:t>r</w:t>
+        </w:r>
+        <w:r>
+          <w:rPr>
+            <w:rStyle w:val="Hyperlink"/>
+            <w:b/>
+            <w:sz w:val="28"/>
+            <w:szCs w:val="28"/>
+          </w:rPr>
+          <w:t>e</w:t>
+        </w:r>
+      </w:hyperlink>
+      <w:r>
+        <w:rPr>
+          <w:b/>
+          <w:sz w:val="28"/>
+          <w:szCs w:val="28"/>
+        </w:rPr>
+        <w:t>.</w:t>
+      </w:r>
+    </w:p>
+    <w:p>
+      <w:pPr>
+        <w:spacing w:after="0"/>
+      </w:pPr>
+    </w:p>
+    <w:p>
+      <w:pPr>
+        <w:spacing w:after="0"/>
+      </w:pPr>
+      <w:r>
+        <w:t>-XX</w:t>
+      </w:r>
+      <w:proofErr w:type="gramStart"/>
+      <w:r>
+        <w:t>:+</w:t>
+      </w:r>
+      <w:proofErr w:type="spellStart"/>
+      <w:proofErr w:type="gramEnd"/>
+      <w:r>
+        <w:t>UnlockDiagnosticVMOptions</w:t>
+      </w:r>
+      <w:proofErr w:type="spellEnd"/>
+    </w:p>
+    <w:p>
+      <w:pPr>
+        <w:spacing w:after="0"/>
+      </w:pPr>
+      <w:r>
+        <w:t>-XX</w:t>
+      </w:r>
+      <w:proofErr w:type="gramStart"/>
+      <w:r>
+        <w:t>:+</w:t>
+      </w:r>
+      <w:proofErr w:type="gramEnd"/>
+      <w:r>
+        <w:t>DebugNonSafepoints-XX:StartFlightRecording=disk=true,dumponexit=true,filename=springboot_prod.jfr,settings=profile,maxage=2m</w:t>
+      </w:r>
+    </w:p>
+    <w:p>
+      <w:pPr>
+        <w:spacing w:after="0"/>
+      </w:pPr>
+    </w:p>
+    <w:p>
+      <w:pPr>
+        <w:spacing w:after="0"/>
+        <w:rPr>
+          <w:rFonts w:ascii="Times New Roman" w:eastAsia="Times New Roman" w:hAnsi="Times New Roman" w:cs="Times New Roman"/>
+          <w:sz w:val="24"/>
+          <w:szCs w:val="24"/>
+          <w:lang w:eastAsia="en-IN"/>
+        </w:rPr>
+      </w:pPr>
+      <w:r>
+        <w:rPr>
+          <w:rFonts w:ascii="Times New Roman" w:eastAsia="Times New Roman" w:hAnsi="Times New Roman" w:cs="Times New Roman"/>
+          <w:sz w:val="24"/>
+          <w:szCs w:val="24"/>
+          <w:lang w:eastAsia="en-IN"/>
+        </w:rPr>
+        <w:t>Above argument will create ‘</w:t>
+      </w:r>
+      <w:proofErr w:type="spellStart"/>
+      <w:r>
+        <w:rPr>
+          <w:rFonts w:ascii="Times New Roman" w:eastAsia="Times New Roman" w:hAnsi="Times New Roman" w:cs="Times New Roman"/>
+          <w:b/>
+          <w:sz w:val="24"/>
+          <w:szCs w:val="24"/>
+          <w:lang w:eastAsia="en-IN"/>
+        </w:rPr>
+        <w:t>springboot_prod.jfr</w:t>
+      </w:r>
+      <w:proofErr w:type="spellEnd"/>
+      <w:r>
+        <w:rPr>
+          <w:rFonts w:ascii="Times New Roman" w:eastAsia="Times New Roman" w:hAnsi="Times New Roman" w:cs="Times New Roman"/>
+          <w:sz w:val="24"/>
+          <w:szCs w:val="24"/>
+          <w:lang w:eastAsia="en-IN"/>
+        </w:rPr>
+        <w:t>’ file at the project root location.</w:t>
+      </w:r>
+    </w:p>
+    <w:p>
+      <w:pPr>
+        <w:spacing w:after="0"/>
+        <w:rPr>
+          <w:rFonts w:ascii="Times New Roman" w:eastAsia="Times New Roman" w:hAnsi="Times New Roman" w:cs="Times New Roman"/>
+          <w:sz w:val="24"/>
+          <w:szCs w:val="24"/>
+          <w:lang w:eastAsia="en-IN"/>
+        </w:rPr>
+      </w:pPr>
+      <w:r>
+        <w:rPr>
+          <w:rFonts w:ascii="Times New Roman" w:eastAsia="Times New Roman" w:hAnsi="Times New Roman" w:cs="Times New Roman"/>
+          <w:sz w:val="24"/>
+          <w:szCs w:val="24"/>
+          <w:lang w:eastAsia="en-IN"/>
+        </w:rPr>
+        <w:t xml:space="preserve">Initially the file may be empty, though using </w:t>
+      </w:r>
+      <w:proofErr w:type="spellStart"/>
+      <w:r>
+        <w:rPr>
+          <w:rFonts w:ascii="Times New Roman" w:eastAsia="Times New Roman" w:hAnsi="Times New Roman" w:cs="Times New Roman"/>
+          <w:b/>
+          <w:sz w:val="24"/>
+          <w:szCs w:val="24"/>
+          <w:lang w:eastAsia="en-IN"/>
+        </w:rPr>
+        <w:t>maxage</w:t>
+      </w:r>
+      <w:proofErr w:type="spellEnd"/>
+      <w:r>
+        <w:rPr>
+          <w:rFonts w:ascii="Times New Roman" w:eastAsia="Times New Roman" w:hAnsi="Times New Roman" w:cs="Times New Roman"/>
+          <w:sz w:val="24"/>
+          <w:szCs w:val="24"/>
+          <w:lang w:eastAsia="en-IN"/>
+        </w:rPr>
+        <w:t xml:space="preserve"> argument, so execute below endpoint from Postman as </w:t>
+      </w:r>
+      <w:r>
+        <w:rPr>
+          <w:rFonts w:ascii="Times New Roman" w:eastAsia="Times New Roman" w:hAnsi="Times New Roman" w:cs="Times New Roman"/>
+          <w:b/>
+          <w:sz w:val="24"/>
+          <w:szCs w:val="24"/>
+          <w:lang w:eastAsia="en-IN"/>
+        </w:rPr>
+        <w:t>Post</w:t>
+      </w:r>
+      <w:r>
+        <w:rPr>
+          <w:rFonts w:ascii="Times New Roman" w:eastAsia="Times New Roman" w:hAnsi="Times New Roman" w:cs="Times New Roman"/>
+          <w:sz w:val="24"/>
+          <w:szCs w:val="24"/>
+          <w:lang w:eastAsia="en-IN"/>
+        </w:rPr>
+        <w:t xml:space="preserve"> request using token for </w:t>
+      </w:r>
+      <w:r>
+        <w:rPr>
+          <w:rFonts w:ascii="Times New Roman" w:eastAsia="Times New Roman" w:hAnsi="Times New Roman" w:cs="Times New Roman"/>
+          <w:b/>
+          <w:sz w:val="24"/>
+          <w:szCs w:val="24"/>
+          <w:lang w:eastAsia="en-IN"/>
+        </w:rPr>
+        <w:t>admin</w:t>
+      </w:r>
+      <w:r>
+        <w:rPr>
+          <w:rFonts w:ascii="Times New Roman" w:eastAsia="Times New Roman" w:hAnsi="Times New Roman" w:cs="Times New Roman"/>
+          <w:sz w:val="24"/>
+          <w:szCs w:val="24"/>
+          <w:lang w:eastAsia="en-IN"/>
+        </w:rPr>
+        <w:t xml:space="preserve"> user</w:t>
+      </w:r>
+      <w:r>
+        <w:rPr>
+          <w:rFonts w:ascii="Times New Roman" w:eastAsia="Times New Roman" w:hAnsi="Times New Roman" w:cs="Times New Roman"/>
+          <w:sz w:val="24"/>
+          <w:szCs w:val="24"/>
+          <w:lang w:eastAsia="en-IN"/>
+        </w:rPr>
+        <w:t>-</w:t>
+      </w:r>
+    </w:p>
+    <w:p>
+      <w:pPr>
+        <w:spacing w:after="0"/>
+        <w:rPr>
+          <w:rFonts w:ascii="Segoe UI" w:hAnsi="Segoe UI" w:cs="Segoe UI"/>
+          <w:color w:val="212121"/>
+          <w:sz w:val="18"/>
+          <w:szCs w:val="18"/>
+          <w:shd w:val="clear" w:color="auto" w:fill="FFFFFF"/>
+        </w:rPr>
+      </w:pPr>
+    </w:p>
+    <w:p>
+      <w:pPr>
+        <w:spacing w:after="0"/>
+        <w:rPr>
+          <w:rFonts w:ascii="Segoe UI" w:hAnsi="Segoe UI" w:cs="Segoe UI"/>
+          <w:i/>
+          <w:color w:val="212121"/>
+          <w:sz w:val="28"/>
+          <w:szCs w:val="28"/>
+          <w:shd w:val="clear" w:color="auto" w:fill="FFFFFF"/>
+        </w:rPr>
+      </w:pPr>
+      <w:hyperlink r:id="rId6" w:history="1">
+        <w:r>
+          <w:rPr>
+            <w:rStyle w:val="Hyperlink"/>
+            <w:rFonts w:ascii="Segoe UI" w:hAnsi="Segoe UI" w:cs="Segoe UI"/>
+            <w:i/>
+            <w:sz w:val="28"/>
+            <w:szCs w:val="28"/>
+            <w:shd w:val="clear" w:color="auto" w:fill="FFFFFF"/>
+          </w:rPr>
+          <w:t>http://localhost:8080/actuator/shutdown</w:t>
+        </w:r>
+      </w:hyperlink>
+    </w:p>
+    <w:p>
+      <w:pPr>
+        <w:spacing w:after="0"/>
+        <w:rPr>
+          <w:rFonts w:ascii="Segoe UI" w:hAnsi="Segoe UI" w:cs="Segoe UI"/>
+          <w:i/>
+          <w:color w:val="212121"/>
+          <w:sz w:val="28"/>
+          <w:szCs w:val="28"/>
+          <w:shd w:val="clear" w:color="auto" w:fill="FFFFFF"/>
+        </w:rPr>
+      </w:pPr>
+    </w:p>
+    <w:p>
+      <w:pPr>
+        <w:spacing w:after="0"/>
+        <w:rPr>
+          <w:rFonts w:ascii="Times New Roman" w:eastAsia="Times New Roman" w:hAnsi="Times New Roman" w:cs="Times New Roman"/>
+          <w:sz w:val="24"/>
+          <w:szCs w:val="24"/>
+          <w:lang w:eastAsia="en-IN"/>
+        </w:rPr>
+      </w:pPr>
+      <w:r>
+        <w:rPr>
+          <w:rFonts w:ascii="Times New Roman" w:eastAsia="Times New Roman" w:hAnsi="Times New Roman" w:cs="Times New Roman"/>
+          <w:sz w:val="24"/>
+          <w:szCs w:val="24"/>
+          <w:lang w:eastAsia="en-IN"/>
+        </w:rPr>
+        <w:t xml:space="preserve">It will gracefully shutdown the app and the data will be dumped in above </w:t>
+      </w:r>
+      <w:r>
+        <w:rPr>
+          <w:rFonts w:ascii="Times New Roman" w:eastAsia="Times New Roman" w:hAnsi="Times New Roman" w:cs="Times New Roman"/>
+          <w:b/>
+          <w:sz w:val="24"/>
+          <w:szCs w:val="24"/>
+          <w:lang w:eastAsia="en-IN"/>
+        </w:rPr>
+        <w:t>.</w:t>
+      </w:r>
+      <w:proofErr w:type="spellStart"/>
+      <w:r>
+        <w:rPr>
+          <w:rFonts w:ascii="Times New Roman" w:eastAsia="Times New Roman" w:hAnsi="Times New Roman" w:cs="Times New Roman"/>
+          <w:b/>
+          <w:sz w:val="24"/>
+          <w:szCs w:val="24"/>
+          <w:lang w:eastAsia="en-IN"/>
+        </w:rPr>
+        <w:t>jfr</w:t>
+      </w:r>
+      <w:proofErr w:type="spellEnd"/>
+      <w:r>
+        <w:rPr>
+          <w:rFonts w:ascii="Times New Roman" w:eastAsia="Times New Roman" w:hAnsi="Times New Roman" w:cs="Times New Roman"/>
+          <w:sz w:val="24"/>
+          <w:szCs w:val="24"/>
+          <w:lang w:eastAsia="en-IN"/>
+        </w:rPr>
+        <w:t xml:space="preserve"> file.</w:t>
+      </w:r>
+    </w:p>
+    <w:p>
+      <w:pPr>
+        <w:spacing w:after="0"/>
+        <w:rPr>
+          <w:rFonts w:ascii="Times New Roman" w:eastAsia="Times New Roman" w:hAnsi="Times New Roman" w:cs="Times New Roman"/>
+          <w:sz w:val="24"/>
+          <w:szCs w:val="24"/>
+          <w:lang w:eastAsia="en-IN"/>
+        </w:rPr>
+      </w:pPr>
+      <w:r>
+        <w:rPr>
+          <w:rFonts w:ascii="Times New Roman" w:eastAsia="Times New Roman" w:hAnsi="Times New Roman" w:cs="Times New Roman"/>
+          <w:sz w:val="24"/>
+          <w:szCs w:val="24"/>
+          <w:lang w:eastAsia="en-IN"/>
+        </w:rPr>
+        <w:t xml:space="preserve">To analyse the above </w:t>
+      </w:r>
+      <w:r>
+        <w:rPr>
+          <w:rFonts w:ascii="Times New Roman" w:eastAsia="Times New Roman" w:hAnsi="Times New Roman" w:cs="Times New Roman"/>
+          <w:b/>
+          <w:sz w:val="24"/>
+          <w:szCs w:val="24"/>
+          <w:lang w:eastAsia="en-IN"/>
+        </w:rPr>
+        <w:t>.</w:t>
+      </w:r>
+      <w:proofErr w:type="spellStart"/>
+      <w:r>
+        <w:rPr>
+          <w:rFonts w:ascii="Times New Roman" w:eastAsia="Times New Roman" w:hAnsi="Times New Roman" w:cs="Times New Roman"/>
+          <w:b/>
+          <w:sz w:val="24"/>
+          <w:szCs w:val="24"/>
+          <w:lang w:eastAsia="en-IN"/>
+        </w:rPr>
+        <w:t>jfr</w:t>
+      </w:r>
+      <w:proofErr w:type="spellEnd"/>
+      <w:r>
+        <w:rPr>
+          <w:rFonts w:ascii="Times New Roman" w:eastAsia="Times New Roman" w:hAnsi="Times New Roman" w:cs="Times New Roman"/>
+          <w:sz w:val="24"/>
+          <w:szCs w:val="24"/>
+          <w:lang w:eastAsia="en-IN"/>
+        </w:rPr>
+        <w:t xml:space="preserve"> file use </w:t>
+      </w:r>
+      <w:r>
+        <w:rPr>
+          <w:rFonts w:ascii="Times New Roman" w:eastAsia="Times New Roman" w:hAnsi="Times New Roman" w:cs="Times New Roman"/>
+          <w:b/>
+          <w:sz w:val="24"/>
+          <w:szCs w:val="24"/>
+          <w:lang w:eastAsia="en-IN"/>
+        </w:rPr>
+        <w:t>JMC</w:t>
+      </w:r>
+      <w:r>
+        <w:rPr>
+          <w:rFonts w:ascii="Times New Roman" w:eastAsia="Times New Roman" w:hAnsi="Times New Roman" w:cs="Times New Roman"/>
+          <w:sz w:val="24"/>
+          <w:szCs w:val="24"/>
+          <w:lang w:eastAsia="en-IN"/>
+        </w:rPr>
+        <w:t xml:space="preserve"> tool</w:t>
+      </w:r>
+      <w:r>
+        <w:rPr>
+          <w:rFonts w:ascii="Times New Roman" w:eastAsia="Times New Roman" w:hAnsi="Times New Roman" w:cs="Times New Roman"/>
+          <w:sz w:val="24"/>
+          <w:szCs w:val="24"/>
+          <w:lang w:eastAsia="en-IN"/>
+        </w:rPr>
+        <w:t xml:space="preserve"> and it will show below kind of view-</w:t>
+      </w:r>
+    </w:p>
+    <w:p>
+      <w:pPr>
+        <w:spacing w:after="0"/>
+        <w:rPr>
+          <w:rFonts w:ascii="Times New Roman" w:eastAsia="Times New Roman" w:hAnsi="Times New Roman" w:cs="Times New Roman"/>
+          <w:sz w:val="24"/>
+          <w:szCs w:val="24"/>
+          <w:lang w:eastAsia="en-IN"/>
+        </w:rPr>
+      </w:pPr>
+    </w:p>
+    <w:p>
+      <w:pPr>
+        <w:spacing w:after="0"/>
+        <w:rPr>
+          <w:rFonts w:ascii="Times New Roman" w:eastAsia="Times New Roman" w:hAnsi="Times New Roman" w:cs="Times New Roman"/>
+          <w:sz w:val="24"/>
+          <w:szCs w:val="24"/>
+          <w:lang w:eastAsia="en-IN"/>
+        </w:rPr>
+      </w:pPr>
+      <w:r>
+        <w:rPr>
+          <w:noProof/>
+          <w:lang w:eastAsia="en-IN"/>
+        </w:rPr>
+        <w:drawing>
+          <wp:inline distT="0" distB="0" distL="0" distR="0" wp14:anchorId="7CFF6D3E" wp14:editId="573D95C8">
+            <wp:extent cx="5731510" cy="3074670"/>
+            <wp:effectExtent l="0" t="0" r="2540" b="0"/>
+            <wp:docPr id="2" name="Picture 2"/>
+            <wp:cNvGraphicFramePr>
+              <a:graphicFrameLocks xmlns:a="http://schemas.openxmlformats.org/drawingml/2006/main" noChangeAspect="1"/>
+            </wp:cNvGraphicFramePr>
+            <a:graphic xmlns:a="http://schemas.openxmlformats.org/drawingml/2006/main">
+              <a:graphicData uri="http://schemas.openxmlformats.org/drawingml/2006/picture">
+                <pic:pic xmlns:pic="http://schemas.openxmlformats.org/drawingml/2006/picture">
+                  <pic:nvPicPr>
+                    <pic:cNvPr id="1" name=""/>
+                    <pic:cNvPicPr/>
+                  </pic:nvPicPr>
+                  <pic:blipFill>
+                    <a:blip r:embed="rId7"/>
+                    <a:stretch>
+                      <a:fillRect/>
+                    </a:stretch>
+                  </pic:blipFill>
+                  <pic:spPr>
+                    <a:xfrm>
+                      <a:off x="0" y="0"/>
+                      <a:ext cx="5731510" cy="3074670"/>
+                    </a:xfrm>
+                    <a:prstGeom prst="rect">
+                      <a:avLst/>
+                    </a:prstGeom>
+                  </pic:spPr>
+                </pic:pic>
+              </a:graphicData>
+            </a:graphic>
+          </wp:inline>
+        </w:drawing>
+      </w:r>
+    </w:p>
     <w:sectPr>
       <w:pgSz w:w="11906" w:h="16838"/>
       <w:pgMar w:top="709" w:right="1440" w:bottom="709" w:left="1440" w:header="708" w:footer="708" w:gutter="0"/>
@@ -6282,6 +6787,29 @@
       <w:bCs/>
     </w:rPr>
   </w:style>
+  <w:style w:type="character" w:styleId="Hyperlink">
+    <w:name w:val="Hyperlink"/>
+    <w:basedOn w:val="DefaultParagraphFont"/>
+    <w:uiPriority w:val="99"/>
+    <w:unhideWhenUsed/>
+    <w:rsid w:val="00AB64D8"/>
+    <w:rPr>
+      <w:color w:val="0563C1" w:themeColor="hyperlink"/>
+      <w:u w:val="single"/>
+    </w:rPr>
+  </w:style>
+  <w:style w:type="character" w:styleId="FollowedHyperlink">
+    <w:name w:val="FollowedHyperlink"/>
+    <w:basedOn w:val="DefaultParagraphFont"/>
+    <w:uiPriority w:val="99"/>
+    <w:semiHidden/>
+    <w:unhideWhenUsed/>
+    <w:rsid w:val="00AB64D8"/>
+    <w:rPr>
+      <w:color w:val="954F72" w:themeColor="followedHyperlink"/>
+      <w:u w:val="single"/>
+    </w:rPr>
+  </w:style>
 </w:styles>
 </file>
 

</xml_diff>